<commit_message>
Regenerate AJBA package with verified figure identity
Co-Authored-By: Tatsuki Onishi <bougtoir@gmail.com>
</commit_message>
<xml_diff>
--- a/denisovan-archaic-dna-analysis/docs/ajba_submission/Table_2_abo_summary.docx
+++ b/denisovan-archaic-dna-analysis/docs/ajba_submission/Table_2_abo_summary.docx
@@ -20,18 +20,16 @@
         <w:tblLook w:firstColumn="1" w:firstRow="1" w:lastColumn="0" w:lastRow="0" w:noHBand="0" w:noVBand="1" w:val="04A0"/>
       </w:tblPr>
       <w:tblGrid>
-        <w:gridCol w:w="1337"/>
-        <w:gridCol w:w="1337"/>
-        <w:gridCol w:w="1337"/>
-        <w:gridCol w:w="1337"/>
-        <w:gridCol w:w="1337"/>
-        <w:gridCol w:w="1337"/>
-        <w:gridCol w:w="1337"/>
+        <w:gridCol w:w="1872"/>
+        <w:gridCol w:w="1872"/>
+        <w:gridCol w:w="1872"/>
+        <w:gridCol w:w="1872"/>
+        <w:gridCol w:w="1872"/>
       </w:tblGrid>
       <w:tr>
         <w:tc>
           <w:tcPr>
-            <w:tcW w:type="dxa" w:w="1337"/>
+            <w:tcW w:type="dxa" w:w="1872"/>
             <w:shd w:fill="D9EAF7"/>
           </w:tcPr>
           <w:p>
@@ -44,13 +42,13 @@
                 <w:b/>
                 <w:sz w:val="17"/>
               </w:rPr>
-              <w:t>Group</w:t>
+              <w:t>Region</w:t>
             </w:r>
           </w:p>
         </w:tc>
         <w:tc>
           <w:tcPr>
-            <w:tcW w:type="dxa" w:w="1337"/>
+            <w:tcW w:type="dxa" w:w="1872"/>
             <w:shd w:fill="D9EAF7"/>
           </w:tcPr>
           <w:p>
@@ -63,13 +61,32 @@
                 <w:b/>
                 <w:sz w:val="17"/>
               </w:rPr>
-              <w:t>Segments</w:t>
+              <w:t>n</w:t>
             </w:r>
           </w:p>
         </w:tc>
         <w:tc>
           <w:tcPr>
-            <w:tcW w:type="dxa" w:w="1337"/>
+            <w:tcW w:type="dxa" w:w="1872"/>
+            <w:shd w:fill="D9EAF7"/>
+          </w:tcPr>
+          <w:p>
+            <w:pPr>
+              <w:spacing w:line="240" w:lineRule="auto"/>
+            </w:pPr>
+            <w:r>
+              <w:rPr>
+                <w:rFonts w:ascii="Arial" w:hAnsi="Arial"/>
+                <w:b/>
+                <w:sz w:val="17"/>
+              </w:rPr>
+              <w:t>Altai %</w:t>
+            </w:r>
+          </w:p>
+        </w:tc>
+        <w:tc>
+          <w:tcPr>
+            <w:tcW w:type="dxa" w:w="1872"/>
             <w:shd w:fill="D9EAF7"/>
           </w:tcPr>
           <w:p>
@@ -88,26 +105,7 @@
         </w:tc>
         <w:tc>
           <w:tcPr>
-            <w:tcW w:type="dxa" w:w="1337"/>
-            <w:shd w:fill="D9EAF7"/>
-          </w:tcPr>
-          <w:p>
-            <w:pPr>
-              <w:spacing w:line="240" w:lineRule="auto"/>
-            </w:pPr>
-            <w:r>
-              <w:rPr>
-                <w:rFonts w:ascii="Arial" w:hAnsi="Arial"/>
-                <w:b/>
-                <w:sz w:val="17"/>
-              </w:rPr>
-              <w:t>Altai %</w:t>
-            </w:r>
-          </w:p>
-        </w:tc>
-        <w:tc>
-          <w:tcPr>
-            <w:tcW w:type="dxa" w:w="1337"/>
+            <w:tcW w:type="dxa" w:w="1872"/>
             <w:shd w:fill="D9EAF7"/>
           </w:tcPr>
           <w:p>
@@ -124,10 +122,11 @@
             </w:r>
           </w:p>
         </w:tc>
+      </w:tr>
+      <w:tr>
         <w:tc>
           <w:tcPr>
-            <w:tcW w:type="dxa" w:w="1337"/>
-            <w:shd w:fill="D9EAF7"/>
+            <w:tcW w:type="dxa" w:w="1872"/>
           </w:tcPr>
           <w:p>
             <w:pPr>
@@ -136,17 +135,16 @@
             <w:r>
               <w:rPr>
                 <w:rFonts w:ascii="Arial" w:hAnsi="Arial"/>
-                <w:b/>
+                <w:b w:val="0"/>
                 <w:sz w:val="17"/>
               </w:rPr>
-              <w:t>Tie %</w:t>
+              <w:t>East Asia</w:t>
             </w:r>
           </w:p>
         </w:tc>
         <w:tc>
           <w:tcPr>
-            <w:tcW w:type="dxa" w:w="1337"/>
-            <w:shd w:fill="D9EAF7"/>
+            <w:tcW w:type="dxa" w:w="1872"/>
           </w:tcPr>
           <w:p>
             <w:pPr>
@@ -155,10 +153,64 @@
             <w:r>
               <w:rPr>
                 <w:rFonts w:ascii="Arial" w:hAnsi="Arial"/>
-                <w:b/>
+                <w:b w:val="0"/>
                 <w:sz w:val="17"/>
               </w:rPr>
-              <w:t>Strict ABO overlap</w:t>
+              <w:t>57</w:t>
+            </w:r>
+          </w:p>
+        </w:tc>
+        <w:tc>
+          <w:tcPr>
+            <w:tcW w:type="dxa" w:w="1872"/>
+          </w:tcPr>
+          <w:p>
+            <w:pPr>
+              <w:spacing w:line="240" w:lineRule="auto"/>
+            </w:pPr>
+            <w:r>
+              <w:rPr>
+                <w:rFonts w:ascii="Arial" w:hAnsi="Arial"/>
+                <w:b w:val="0"/>
+                <w:sz w:val="17"/>
+              </w:rPr>
+              <w:t>54.4</w:t>
+            </w:r>
+          </w:p>
+        </w:tc>
+        <w:tc>
+          <w:tcPr>
+            <w:tcW w:type="dxa" w:w="1872"/>
+          </w:tcPr>
+          <w:p>
+            <w:pPr>
+              <w:spacing w:line="240" w:lineRule="auto"/>
+            </w:pPr>
+            <w:r>
+              <w:rPr>
+                <w:rFonts w:ascii="Arial" w:hAnsi="Arial"/>
+                <w:b w:val="0"/>
+                <w:sz w:val="17"/>
+              </w:rPr>
+              <w:t>1.8</w:t>
+            </w:r>
+          </w:p>
+        </w:tc>
+        <w:tc>
+          <w:tcPr>
+            <w:tcW w:type="dxa" w:w="1872"/>
+          </w:tcPr>
+          <w:p>
+            <w:pPr>
+              <w:spacing w:line="240" w:lineRule="auto"/>
+            </w:pPr>
+            <w:r>
+              <w:rPr>
+                <w:rFonts w:ascii="Arial" w:hAnsi="Arial"/>
+                <w:b w:val="0"/>
+                <w:sz w:val="17"/>
+              </w:rPr>
+              <w:t>43.9</w:t>
             </w:r>
           </w:p>
         </w:tc>
@@ -166,7 +218,7 @@
       <w:tr>
         <w:tc>
           <w:tcPr>
-            <w:tcW w:type="dxa" w:w="1337"/>
+            <w:tcW w:type="dxa" w:w="1872"/>
           </w:tcPr>
           <w:p>
             <w:pPr>
@@ -184,7 +236,7 @@
         </w:tc>
         <w:tc>
           <w:tcPr>
-            <w:tcW w:type="dxa" w:w="1337"/>
+            <w:tcW w:type="dxa" w:w="1872"/>
           </w:tcPr>
           <w:p>
             <w:pPr>
@@ -196,13 +248,13 @@
                 <w:b w:val="0"/>
                 <w:sz w:val="17"/>
               </w:rPr>
-              <w:t>388</w:t>
+              <w:t>275</w:t>
             </w:r>
           </w:p>
         </w:tc>
         <w:tc>
           <w:tcPr>
-            <w:tcW w:type="dxa" w:w="1337"/>
+            <w:tcW w:type="dxa" w:w="1872"/>
           </w:tcPr>
           <w:p>
             <w:pPr>
@@ -214,13 +266,13 @@
                 <w:b w:val="0"/>
                 <w:sz w:val="17"/>
               </w:rPr>
-              <w:t>33.0</w:t>
+              <w:t>7.3</w:t>
             </w:r>
           </w:p>
         </w:tc>
         <w:tc>
           <w:tcPr>
-            <w:tcW w:type="dxa" w:w="1337"/>
+            <w:tcW w:type="dxa" w:w="1872"/>
           </w:tcPr>
           <w:p>
             <w:pPr>
@@ -232,13 +284,13 @@
                 <w:b w:val="0"/>
                 <w:sz w:val="17"/>
               </w:rPr>
-              <w:t>5.2</w:t>
+              <w:t>46.5</w:t>
             </w:r>
           </w:p>
         </w:tc>
         <w:tc>
           <w:tcPr>
-            <w:tcW w:type="dxa" w:w="1337"/>
+            <w:tcW w:type="dxa" w:w="1872"/>
           </w:tcPr>
           <w:p>
             <w:pPr>
@@ -250,13 +302,15 @@
                 <w:b w:val="0"/>
                 <w:sz w:val="17"/>
               </w:rPr>
-              <w:t>32.7</w:t>
+              <w:t>46.2</w:t>
             </w:r>
           </w:p>
         </w:tc>
+      </w:tr>
+      <w:tr>
         <w:tc>
           <w:tcPr>
-            <w:tcW w:type="dxa" w:w="1337"/>
+            <w:tcW w:type="dxa" w:w="1872"/>
           </w:tcPr>
           <w:p>
             <w:pPr>
@@ -268,13 +322,13 @@
                 <w:b w:val="0"/>
                 <w:sz w:val="17"/>
               </w:rPr>
-              <w:t>29.1</w:t>
+              <w:t>Indigenous Americas</w:t>
             </w:r>
           </w:p>
         </w:tc>
         <w:tc>
           <w:tcPr>
-            <w:tcW w:type="dxa" w:w="1337"/>
+            <w:tcW w:type="dxa" w:w="1872"/>
           </w:tcPr>
           <w:p>
             <w:pPr>
@@ -286,7 +340,61 @@
                 <w:b w:val="0"/>
                 <w:sz w:val="17"/>
               </w:rPr>
-              <w:t>56</w:t>
+              <w:t>2</w:t>
+            </w:r>
+          </w:p>
+        </w:tc>
+        <w:tc>
+          <w:tcPr>
+            <w:tcW w:type="dxa" w:w="1872"/>
+          </w:tcPr>
+          <w:p>
+            <w:pPr>
+              <w:spacing w:line="240" w:lineRule="auto"/>
+            </w:pPr>
+            <w:r>
+              <w:rPr>
+                <w:rFonts w:ascii="Arial" w:hAnsi="Arial"/>
+                <w:b w:val="0"/>
+                <w:sz w:val="17"/>
+              </w:rPr>
+              <w:t>0.0</w:t>
+            </w:r>
+          </w:p>
+        </w:tc>
+        <w:tc>
+          <w:tcPr>
+            <w:tcW w:type="dxa" w:w="1872"/>
+          </w:tcPr>
+          <w:p>
+            <w:pPr>
+              <w:spacing w:line="240" w:lineRule="auto"/>
+            </w:pPr>
+            <w:r>
+              <w:rPr>
+                <w:rFonts w:ascii="Arial" w:hAnsi="Arial"/>
+                <w:b w:val="0"/>
+                <w:sz w:val="17"/>
+              </w:rPr>
+              <w:t>100.0</w:t>
+            </w:r>
+          </w:p>
+        </w:tc>
+        <w:tc>
+          <w:tcPr>
+            <w:tcW w:type="dxa" w:w="1872"/>
+          </w:tcPr>
+          <w:p>
+            <w:pPr>
+              <w:spacing w:line="240" w:lineRule="auto"/>
+            </w:pPr>
+            <w:r>
+              <w:rPr>
+                <w:rFonts w:ascii="Arial" w:hAnsi="Arial"/>
+                <w:b w:val="0"/>
+                <w:sz w:val="17"/>
+              </w:rPr>
+              <w:t>0.0</w:t>
             </w:r>
           </w:p>
         </w:tc>
@@ -294,7 +402,191 @@
       <w:tr>
         <w:tc>
           <w:tcPr>
-            <w:tcW w:type="dxa" w:w="1337"/>
+            <w:tcW w:type="dxa" w:w="1872"/>
+          </w:tcPr>
+          <w:p>
+            <w:pPr>
+              <w:spacing w:line="240" w:lineRule="auto"/>
+            </w:pPr>
+            <w:r>
+              <w:rPr>
+                <w:rFonts w:ascii="Arial" w:hAnsi="Arial"/>
+                <w:b w:val="0"/>
+                <w:sz w:val="17"/>
+              </w:rPr>
+              <w:t>Admixed Americas</w:t>
+            </w:r>
+          </w:p>
+        </w:tc>
+        <w:tc>
+          <w:tcPr>
+            <w:tcW w:type="dxa" w:w="1872"/>
+          </w:tcPr>
+          <w:p>
+            <w:pPr>
+              <w:spacing w:line="240" w:lineRule="auto"/>
+            </w:pPr>
+            <w:r>
+              <w:rPr>
+                <w:rFonts w:ascii="Arial" w:hAnsi="Arial"/>
+                <w:b w:val="0"/>
+                <w:sz w:val="17"/>
+              </w:rPr>
+              <w:t>98</w:t>
+            </w:r>
+          </w:p>
+        </w:tc>
+        <w:tc>
+          <w:tcPr>
+            <w:tcW w:type="dxa" w:w="1872"/>
+          </w:tcPr>
+          <w:p>
+            <w:pPr>
+              <w:spacing w:line="240" w:lineRule="auto"/>
+            </w:pPr>
+            <w:r>
+              <w:rPr>
+                <w:rFonts w:ascii="Arial" w:hAnsi="Arial"/>
+                <w:b w:val="0"/>
+                <w:sz w:val="17"/>
+              </w:rPr>
+              <w:t>3.1</w:t>
+            </w:r>
+          </w:p>
+        </w:tc>
+        <w:tc>
+          <w:tcPr>
+            <w:tcW w:type="dxa" w:w="1872"/>
+          </w:tcPr>
+          <w:p>
+            <w:pPr>
+              <w:spacing w:line="240" w:lineRule="auto"/>
+            </w:pPr>
+            <w:r>
+              <w:rPr>
+                <w:rFonts w:ascii="Arial" w:hAnsi="Arial"/>
+                <w:b w:val="0"/>
+                <w:sz w:val="17"/>
+              </w:rPr>
+              <w:t>61.2</w:t>
+            </w:r>
+          </w:p>
+        </w:tc>
+        <w:tc>
+          <w:tcPr>
+            <w:tcW w:type="dxa" w:w="1872"/>
+          </w:tcPr>
+          <w:p>
+            <w:pPr>
+              <w:spacing w:line="240" w:lineRule="auto"/>
+            </w:pPr>
+            <w:r>
+              <w:rPr>
+                <w:rFonts w:ascii="Arial" w:hAnsi="Arial"/>
+                <w:b w:val="0"/>
+                <w:sz w:val="17"/>
+              </w:rPr>
+              <w:t>35.7</w:t>
+            </w:r>
+          </w:p>
+        </w:tc>
+      </w:tr>
+      <w:tr>
+        <w:tc>
+          <w:tcPr>
+            <w:tcW w:type="dxa" w:w="1872"/>
+          </w:tcPr>
+          <w:p>
+            <w:pPr>
+              <w:spacing w:line="240" w:lineRule="auto"/>
+            </w:pPr>
+            <w:r>
+              <w:rPr>
+                <w:rFonts w:ascii="Arial" w:hAnsi="Arial"/>
+                <w:b w:val="0"/>
+                <w:sz w:val="17"/>
+              </w:rPr>
+              <w:t>Central/South Asia</w:t>
+            </w:r>
+          </w:p>
+        </w:tc>
+        <w:tc>
+          <w:tcPr>
+            <w:tcW w:type="dxa" w:w="1872"/>
+          </w:tcPr>
+          <w:p>
+            <w:pPr>
+              <w:spacing w:line="240" w:lineRule="auto"/>
+            </w:pPr>
+            <w:r>
+              <w:rPr>
+                <w:rFonts w:ascii="Arial" w:hAnsi="Arial"/>
+                <w:b w:val="0"/>
+                <w:sz w:val="17"/>
+              </w:rPr>
+              <w:t>98</w:t>
+            </w:r>
+          </w:p>
+        </w:tc>
+        <w:tc>
+          <w:tcPr>
+            <w:tcW w:type="dxa" w:w="1872"/>
+          </w:tcPr>
+          <w:p>
+            <w:pPr>
+              <w:spacing w:line="240" w:lineRule="auto"/>
+            </w:pPr>
+            <w:r>
+              <w:rPr>
+                <w:rFonts w:ascii="Arial" w:hAnsi="Arial"/>
+                <w:b w:val="0"/>
+                <w:sz w:val="17"/>
+              </w:rPr>
+              <w:t>9.2</w:t>
+            </w:r>
+          </w:p>
+        </w:tc>
+        <w:tc>
+          <w:tcPr>
+            <w:tcW w:type="dxa" w:w="1872"/>
+          </w:tcPr>
+          <w:p>
+            <w:pPr>
+              <w:spacing w:line="240" w:lineRule="auto"/>
+            </w:pPr>
+            <w:r>
+              <w:rPr>
+                <w:rFonts w:ascii="Arial" w:hAnsi="Arial"/>
+                <w:b w:val="0"/>
+                <w:sz w:val="17"/>
+              </w:rPr>
+              <w:t>44.9</w:t>
+            </w:r>
+          </w:p>
+        </w:tc>
+        <w:tc>
+          <w:tcPr>
+            <w:tcW w:type="dxa" w:w="1872"/>
+          </w:tcPr>
+          <w:p>
+            <w:pPr>
+              <w:spacing w:line="240" w:lineRule="auto"/>
+            </w:pPr>
+            <w:r>
+              <w:rPr>
+                <w:rFonts w:ascii="Arial" w:hAnsi="Arial"/>
+                <w:b w:val="0"/>
+                <w:sz w:val="17"/>
+              </w:rPr>
+              <w:t>45.9</w:t>
+            </w:r>
+          </w:p>
+        </w:tc>
+      </w:tr>
+      <w:tr>
+        <w:tc>
+          <w:tcPr>
+            <w:tcW w:type="dxa" w:w="1872"/>
           </w:tcPr>
           <w:p>
             <w:pPr>
@@ -312,7 +604,7 @@
         </w:tc>
         <w:tc>
           <w:tcPr>
-            <w:tcW w:type="dxa" w:w="1337"/>
+            <w:tcW w:type="dxa" w:w="1872"/>
           </w:tcPr>
           <w:p>
             <w:pPr>
@@ -324,13 +616,13 @@
                 <w:b w:val="0"/>
                 <w:sz w:val="17"/>
               </w:rPr>
-              <w:t>59</w:t>
+              <w:t>44</w:t>
             </w:r>
           </w:p>
         </w:tc>
         <w:tc>
           <w:tcPr>
-            <w:tcW w:type="dxa" w:w="1337"/>
+            <w:tcW w:type="dxa" w:w="1872"/>
           </w:tcPr>
           <w:p>
             <w:pPr>
@@ -342,13 +634,13 @@
                 <w:b w:val="0"/>
                 <w:sz w:val="17"/>
               </w:rPr>
-              <w:t>39.0</w:t>
+              <w:t>11.4</w:t>
             </w:r>
           </w:p>
         </w:tc>
         <w:tc>
           <w:tcPr>
-            <w:tcW w:type="dxa" w:w="1337"/>
+            <w:tcW w:type="dxa" w:w="1872"/>
           </w:tcPr>
           <w:p>
             <w:pPr>
@@ -360,13 +652,13 @@
                 <w:b w:val="0"/>
                 <w:sz w:val="17"/>
               </w:rPr>
-              <w:t>8.5</w:t>
+              <w:t>52.3</w:t>
             </w:r>
           </w:p>
         </w:tc>
         <w:tc>
           <w:tcPr>
-            <w:tcW w:type="dxa" w:w="1337"/>
+            <w:tcW w:type="dxa" w:w="1872"/>
           </w:tcPr>
           <w:p>
             <w:pPr>
@@ -378,43 +670,7 @@
                 <w:b w:val="0"/>
                 <w:sz w:val="17"/>
               </w:rPr>
-              <w:t>27.1</w:t>
-            </w:r>
-          </w:p>
-        </w:tc>
-        <w:tc>
-          <w:tcPr>
-            <w:tcW w:type="dxa" w:w="1337"/>
-          </w:tcPr>
-          <w:p>
-            <w:pPr>
-              <w:spacing w:line="240" w:lineRule="auto"/>
-            </w:pPr>
-            <w:r>
-              <w:rPr>
-                <w:rFonts w:ascii="Arial" w:hAnsi="Arial"/>
-                <w:b w:val="0"/>
-                <w:sz w:val="17"/>
-              </w:rPr>
-              <w:t>25.4</w:t>
-            </w:r>
-          </w:p>
-        </w:tc>
-        <w:tc>
-          <w:tcPr>
-            <w:tcW w:type="dxa" w:w="1337"/>
-          </w:tcPr>
-          <w:p>
-            <w:pPr>
-              <w:spacing w:line="240" w:lineRule="auto"/>
-            </w:pPr>
-            <w:r>
-              <w:rPr>
-                <w:rFonts w:ascii="Arial" w:hAnsi="Arial"/>
-                <w:b w:val="0"/>
-                <w:sz w:val="17"/>
-              </w:rPr>
-              <w:t>8</w:t>
+              <w:t>36.4</w:t>
             </w:r>
           </w:p>
         </w:tc>
@@ -422,263 +678,7 @@
       <w:tr>
         <w:tc>
           <w:tcPr>
-            <w:tcW w:type="dxa" w:w="1337"/>
-          </w:tcPr>
-          <w:p>
-            <w:pPr>
-              <w:spacing w:line="240" w:lineRule="auto"/>
-            </w:pPr>
-            <w:r>
-              <w:rPr>
-                <w:rFonts w:ascii="Arial" w:hAnsi="Arial"/>
-                <w:b w:val="0"/>
-                <w:sz w:val="17"/>
-              </w:rPr>
-              <w:t>Central/South Asia</w:t>
-            </w:r>
-          </w:p>
-        </w:tc>
-        <w:tc>
-          <w:tcPr>
-            <w:tcW w:type="dxa" w:w="1337"/>
-          </w:tcPr>
-          <w:p>
-            <w:pPr>
-              <w:spacing w:line="240" w:lineRule="auto"/>
-            </w:pPr>
-            <w:r>
-              <w:rPr>
-                <w:rFonts w:ascii="Arial" w:hAnsi="Arial"/>
-                <w:b w:val="0"/>
-                <w:sz w:val="17"/>
-              </w:rPr>
-              <w:t>140</w:t>
-            </w:r>
-          </w:p>
-        </w:tc>
-        <w:tc>
-          <w:tcPr>
-            <w:tcW w:type="dxa" w:w="1337"/>
-          </w:tcPr>
-          <w:p>
-            <w:pPr>
-              <w:spacing w:line="240" w:lineRule="auto"/>
-            </w:pPr>
-            <w:r>
-              <w:rPr>
-                <w:rFonts w:ascii="Arial" w:hAnsi="Arial"/>
-                <w:b w:val="0"/>
-                <w:sz w:val="17"/>
-              </w:rPr>
-              <w:t>31.4</w:t>
-            </w:r>
-          </w:p>
-        </w:tc>
-        <w:tc>
-          <w:tcPr>
-            <w:tcW w:type="dxa" w:w="1337"/>
-          </w:tcPr>
-          <w:p>
-            <w:pPr>
-              <w:spacing w:line="240" w:lineRule="auto"/>
-            </w:pPr>
-            <w:r>
-              <w:rPr>
-                <w:rFonts w:ascii="Arial" w:hAnsi="Arial"/>
-                <w:b w:val="0"/>
-                <w:sz w:val="17"/>
-              </w:rPr>
-              <w:t>6.4</w:t>
-            </w:r>
-          </w:p>
-        </w:tc>
-        <w:tc>
-          <w:tcPr>
-            <w:tcW w:type="dxa" w:w="1337"/>
-          </w:tcPr>
-          <w:p>
-            <w:pPr>
-              <w:spacing w:line="240" w:lineRule="auto"/>
-            </w:pPr>
-            <w:r>
-              <w:rPr>
-                <w:rFonts w:ascii="Arial" w:hAnsi="Arial"/>
-                <w:b w:val="0"/>
-                <w:sz w:val="17"/>
-              </w:rPr>
-              <w:t>32.1</w:t>
-            </w:r>
-          </w:p>
-        </w:tc>
-        <w:tc>
-          <w:tcPr>
-            <w:tcW w:type="dxa" w:w="1337"/>
-          </w:tcPr>
-          <w:p>
-            <w:pPr>
-              <w:spacing w:line="240" w:lineRule="auto"/>
-            </w:pPr>
-            <w:r>
-              <w:rPr>
-                <w:rFonts w:ascii="Arial" w:hAnsi="Arial"/>
-                <w:b w:val="0"/>
-                <w:sz w:val="17"/>
-              </w:rPr>
-              <w:t>30.0</w:t>
-            </w:r>
-          </w:p>
-        </w:tc>
-        <w:tc>
-          <w:tcPr>
-            <w:tcW w:type="dxa" w:w="1337"/>
-          </w:tcPr>
-          <w:p>
-            <w:pPr>
-              <w:spacing w:line="240" w:lineRule="auto"/>
-            </w:pPr>
-            <w:r>
-              <w:rPr>
-                <w:rFonts w:ascii="Arial" w:hAnsi="Arial"/>
-                <w:b w:val="0"/>
-                <w:sz w:val="17"/>
-              </w:rPr>
-              <w:t>31</w:t>
-            </w:r>
-          </w:p>
-        </w:tc>
-      </w:tr>
-      <w:tr>
-        <w:tc>
-          <w:tcPr>
-            <w:tcW w:type="dxa" w:w="1337"/>
-          </w:tcPr>
-          <w:p>
-            <w:pPr>
-              <w:spacing w:line="240" w:lineRule="auto"/>
-            </w:pPr>
-            <w:r>
-              <w:rPr>
-                <w:rFonts w:ascii="Arial" w:hAnsi="Arial"/>
-                <w:b w:val="0"/>
-                <w:sz w:val="17"/>
-              </w:rPr>
-              <w:t>East Asia</w:t>
-            </w:r>
-          </w:p>
-        </w:tc>
-        <w:tc>
-          <w:tcPr>
-            <w:tcW w:type="dxa" w:w="1337"/>
-          </w:tcPr>
-          <w:p>
-            <w:pPr>
-              <w:spacing w:line="240" w:lineRule="auto"/>
-            </w:pPr>
-            <w:r>
-              <w:rPr>
-                <w:rFonts w:ascii="Arial" w:hAnsi="Arial"/>
-                <w:b w:val="0"/>
-                <w:sz w:val="17"/>
-              </w:rPr>
-              <w:t>69</w:t>
-            </w:r>
-          </w:p>
-        </w:tc>
-        <w:tc>
-          <w:tcPr>
-            <w:tcW w:type="dxa" w:w="1337"/>
-          </w:tcPr>
-          <w:p>
-            <w:pPr>
-              <w:spacing w:line="240" w:lineRule="auto"/>
-            </w:pPr>
-            <w:r>
-              <w:rPr>
-                <w:rFonts w:ascii="Arial" w:hAnsi="Arial"/>
-                <w:b w:val="0"/>
-                <w:sz w:val="17"/>
-              </w:rPr>
-              <w:t>1.4</w:t>
-            </w:r>
-          </w:p>
-        </w:tc>
-        <w:tc>
-          <w:tcPr>
-            <w:tcW w:type="dxa" w:w="1337"/>
-          </w:tcPr>
-          <w:p>
-            <w:pPr>
-              <w:spacing w:line="240" w:lineRule="auto"/>
-            </w:pPr>
-            <w:r>
-              <w:rPr>
-                <w:rFonts w:ascii="Arial" w:hAnsi="Arial"/>
-                <w:b w:val="0"/>
-                <w:sz w:val="17"/>
-              </w:rPr>
-              <w:t>44.9</w:t>
-            </w:r>
-          </w:p>
-        </w:tc>
-        <w:tc>
-          <w:tcPr>
-            <w:tcW w:type="dxa" w:w="1337"/>
-          </w:tcPr>
-          <w:p>
-            <w:pPr>
-              <w:spacing w:line="240" w:lineRule="auto"/>
-            </w:pPr>
-            <w:r>
-              <w:rPr>
-                <w:rFonts w:ascii="Arial" w:hAnsi="Arial"/>
-                <w:b w:val="0"/>
-                <w:sz w:val="17"/>
-              </w:rPr>
-              <w:t>36.2</w:t>
-            </w:r>
-          </w:p>
-        </w:tc>
-        <w:tc>
-          <w:tcPr>
-            <w:tcW w:type="dxa" w:w="1337"/>
-          </w:tcPr>
-          <w:p>
-            <w:pPr>
-              <w:spacing w:line="240" w:lineRule="auto"/>
-            </w:pPr>
-            <w:r>
-              <w:rPr>
-                <w:rFonts w:ascii="Arial" w:hAnsi="Arial"/>
-                <w:b w:val="0"/>
-                <w:sz w:val="17"/>
-              </w:rPr>
-              <w:t>17.4</w:t>
-            </w:r>
-          </w:p>
-        </w:tc>
-        <w:tc>
-          <w:tcPr>
-            <w:tcW w:type="dxa" w:w="1337"/>
-          </w:tcPr>
-          <w:p>
-            <w:pPr>
-              <w:spacing w:line="240" w:lineRule="auto"/>
-            </w:pPr>
-            <w:r>
-              <w:rPr>
-                <w:rFonts w:ascii="Arial" w:hAnsi="Arial"/>
-                <w:b w:val="0"/>
-                <w:sz w:val="17"/>
-              </w:rPr>
-              <w:t>12</w:t>
-            </w:r>
-          </w:p>
-        </w:tc>
-      </w:tr>
-      <w:tr>
-        <w:tc>
-          <w:tcPr>
-            <w:tcW w:type="dxa" w:w="1337"/>
+            <w:tcW w:type="dxa" w:w="1872"/>
           </w:tcPr>
           <w:p>
             <w:pPr>
@@ -696,7 +696,7 @@
         </w:tc>
         <w:tc>
           <w:tcPr>
-            <w:tcW w:type="dxa" w:w="1337"/>
+            <w:tcW w:type="dxa" w:w="1872"/>
           </w:tcPr>
           <w:p>
             <w:pPr>
@@ -708,13 +708,13 @@
                 <w:b w:val="0"/>
                 <w:sz w:val="17"/>
               </w:rPr>
-              <w:t>26</w:t>
+              <w:t>13</w:t>
             </w:r>
           </w:p>
         </w:tc>
         <w:tc>
           <w:tcPr>
-            <w:tcW w:type="dxa" w:w="1337"/>
+            <w:tcW w:type="dxa" w:w="1872"/>
           </w:tcPr>
           <w:p>
             <w:pPr>
@@ -732,7 +732,7 @@
         </w:tc>
         <w:tc>
           <w:tcPr>
-            <w:tcW w:type="dxa" w:w="1337"/>
+            <w:tcW w:type="dxa" w:w="1872"/>
           </w:tcPr>
           <w:p>
             <w:pPr>
@@ -750,227 +750,7 @@
         </w:tc>
         <w:tc>
           <w:tcPr>
-            <w:tcW w:type="dxa" w:w="1337"/>
-          </w:tcPr>
-          <w:p>
-            <w:pPr>
-              <w:spacing w:line="240" w:lineRule="auto"/>
-            </w:pPr>
-            <w:r>
-              <w:rPr>
-                <w:rFonts w:ascii="Arial" w:hAnsi="Arial"/>
-                <w:b w:val="0"/>
-                <w:sz w:val="17"/>
-              </w:rPr>
-              <w:t>50.0</w:t>
-            </w:r>
-          </w:p>
-        </w:tc>
-        <w:tc>
-          <w:tcPr>
-            <w:tcW w:type="dxa" w:w="1337"/>
-          </w:tcPr>
-          <w:p>
-            <w:pPr>
-              <w:spacing w:line="240" w:lineRule="auto"/>
-            </w:pPr>
-            <w:r>
-              <w:rPr>
-                <w:rFonts w:ascii="Arial" w:hAnsi="Arial"/>
-                <w:b w:val="0"/>
-                <w:sz w:val="17"/>
-              </w:rPr>
-              <w:t>50.0</w:t>
-            </w:r>
-          </w:p>
-        </w:tc>
-        <w:tc>
-          <w:tcPr>
-            <w:tcW w:type="dxa" w:w="1337"/>
-          </w:tcPr>
-          <w:p>
-            <w:pPr>
-              <w:spacing w:line="240" w:lineRule="auto"/>
-            </w:pPr>
-            <w:r>
-              <w:rPr>
-                <w:rFonts w:ascii="Arial" w:hAnsi="Arial"/>
-                <w:b w:val="0"/>
-                <w:sz w:val="17"/>
-              </w:rPr>
-              <w:t>1</w:t>
-            </w:r>
-          </w:p>
-        </w:tc>
-      </w:tr>
-      <w:tr>
-        <w:tc>
-          <w:tcPr>
-            <w:tcW w:type="dxa" w:w="1337"/>
-          </w:tcPr>
-          <w:p>
-            <w:pPr>
-              <w:spacing w:line="240" w:lineRule="auto"/>
-            </w:pPr>
-            <w:r>
-              <w:rPr>
-                <w:rFonts w:ascii="Arial" w:hAnsi="Arial"/>
-                <w:b w:val="0"/>
-                <w:sz w:val="17"/>
-              </w:rPr>
-              <w:t>Admixed Americas</w:t>
-            </w:r>
-          </w:p>
-        </w:tc>
-        <w:tc>
-          <w:tcPr>
-            <w:tcW w:type="dxa" w:w="1337"/>
-          </w:tcPr>
-          <w:p>
-            <w:pPr>
-              <w:spacing w:line="240" w:lineRule="auto"/>
-            </w:pPr>
-            <w:r>
-              <w:rPr>
-                <w:rFonts w:ascii="Arial" w:hAnsi="Arial"/>
-                <w:b w:val="0"/>
-                <w:sz w:val="17"/>
-              </w:rPr>
-              <w:t>150</w:t>
-            </w:r>
-          </w:p>
-        </w:tc>
-        <w:tc>
-          <w:tcPr>
-            <w:tcW w:type="dxa" w:w="1337"/>
-          </w:tcPr>
-          <w:p>
-            <w:pPr>
-              <w:spacing w:line="240" w:lineRule="auto"/>
-            </w:pPr>
-            <w:r>
-              <w:rPr>
-                <w:rFonts w:ascii="Arial" w:hAnsi="Arial"/>
-                <w:b w:val="0"/>
-                <w:sz w:val="17"/>
-              </w:rPr>
-              <w:t>40.0</w:t>
-            </w:r>
-          </w:p>
-        </w:tc>
-        <w:tc>
-          <w:tcPr>
-            <w:tcW w:type="dxa" w:w="1337"/>
-          </w:tcPr>
-          <w:p>
-            <w:pPr>
-              <w:spacing w:line="240" w:lineRule="auto"/>
-            </w:pPr>
-            <w:r>
-              <w:rPr>
-                <w:rFonts w:ascii="Arial" w:hAnsi="Arial"/>
-                <w:b w:val="0"/>
-                <w:sz w:val="17"/>
-              </w:rPr>
-              <w:t>2.0</w:t>
-            </w:r>
-          </w:p>
-        </w:tc>
-        <w:tc>
-          <w:tcPr>
-            <w:tcW w:type="dxa" w:w="1337"/>
-          </w:tcPr>
-          <w:p>
-            <w:pPr>
-              <w:spacing w:line="240" w:lineRule="auto"/>
-            </w:pPr>
-            <w:r>
-              <w:rPr>
-                <w:rFonts w:ascii="Arial" w:hAnsi="Arial"/>
-                <w:b w:val="0"/>
-                <w:sz w:val="17"/>
-              </w:rPr>
-              <w:t>23.3</w:t>
-            </w:r>
-          </w:p>
-        </w:tc>
-        <w:tc>
-          <w:tcPr>
-            <w:tcW w:type="dxa" w:w="1337"/>
-          </w:tcPr>
-          <w:p>
-            <w:pPr>
-              <w:spacing w:line="240" w:lineRule="auto"/>
-            </w:pPr>
-            <w:r>
-              <w:rPr>
-                <w:rFonts w:ascii="Arial" w:hAnsi="Arial"/>
-                <w:b w:val="0"/>
-                <w:sz w:val="17"/>
-              </w:rPr>
-              <w:t>34.7</w:t>
-            </w:r>
-          </w:p>
-        </w:tc>
-        <w:tc>
-          <w:tcPr>
-            <w:tcW w:type="dxa" w:w="1337"/>
-          </w:tcPr>
-          <w:p>
-            <w:pPr>
-              <w:spacing w:line="240" w:lineRule="auto"/>
-            </w:pPr>
-            <w:r>
-              <w:rPr>
-                <w:rFonts w:ascii="Arial" w:hAnsi="Arial"/>
-                <w:b w:val="0"/>
-                <w:sz w:val="17"/>
-              </w:rPr>
-              <w:t>20</w:t>
-            </w:r>
-          </w:p>
-        </w:tc>
-      </w:tr>
-      <w:tr>
-        <w:tc>
-          <w:tcPr>
-            <w:tcW w:type="dxa" w:w="1337"/>
-          </w:tcPr>
-          <w:p>
-            <w:pPr>
-              <w:spacing w:line="240" w:lineRule="auto"/>
-            </w:pPr>
-            <w:r>
-              <w:rPr>
-                <w:rFonts w:ascii="Arial" w:hAnsi="Arial"/>
-                <w:b w:val="0"/>
-                <w:sz w:val="17"/>
-              </w:rPr>
-              <w:t>Indigenous Americas</w:t>
-            </w:r>
-          </w:p>
-        </w:tc>
-        <w:tc>
-          <w:tcPr>
-            <w:tcW w:type="dxa" w:w="1337"/>
-          </w:tcPr>
-          <w:p>
-            <w:pPr>
-              <w:spacing w:line="240" w:lineRule="auto"/>
-            </w:pPr>
-            <w:r>
-              <w:rPr>
-                <w:rFonts w:ascii="Arial" w:hAnsi="Arial"/>
-                <w:b w:val="0"/>
-                <w:sz w:val="17"/>
-              </w:rPr>
-              <w:t>2</w:t>
-            </w:r>
-          </w:p>
-        </w:tc>
-        <w:tc>
-          <w:tcPr>
-            <w:tcW w:type="dxa" w:w="1337"/>
+            <w:tcW w:type="dxa" w:w="1872"/>
           </w:tcPr>
           <w:p>
             <w:pPr>
@@ -986,78 +766,6 @@
             </w:r>
           </w:p>
         </w:tc>
-        <w:tc>
-          <w:tcPr>
-            <w:tcW w:type="dxa" w:w="1337"/>
-          </w:tcPr>
-          <w:p>
-            <w:pPr>
-              <w:spacing w:line="240" w:lineRule="auto"/>
-            </w:pPr>
-            <w:r>
-              <w:rPr>
-                <w:rFonts w:ascii="Arial" w:hAnsi="Arial"/>
-                <w:b w:val="0"/>
-                <w:sz w:val="17"/>
-              </w:rPr>
-              <w:t>0.0</w:t>
-            </w:r>
-          </w:p>
-        </w:tc>
-        <w:tc>
-          <w:tcPr>
-            <w:tcW w:type="dxa" w:w="1337"/>
-          </w:tcPr>
-          <w:p>
-            <w:pPr>
-              <w:spacing w:line="240" w:lineRule="auto"/>
-            </w:pPr>
-            <w:r>
-              <w:rPr>
-                <w:rFonts w:ascii="Arial" w:hAnsi="Arial"/>
-                <w:b w:val="0"/>
-                <w:sz w:val="17"/>
-              </w:rPr>
-              <w:t>0.0</w:t>
-            </w:r>
-          </w:p>
-        </w:tc>
-        <w:tc>
-          <w:tcPr>
-            <w:tcW w:type="dxa" w:w="1337"/>
-          </w:tcPr>
-          <w:p>
-            <w:pPr>
-              <w:spacing w:line="240" w:lineRule="auto"/>
-            </w:pPr>
-            <w:r>
-              <w:rPr>
-                <w:rFonts w:ascii="Arial" w:hAnsi="Arial"/>
-                <w:b w:val="0"/>
-                <w:sz w:val="17"/>
-              </w:rPr>
-              <w:t>0.0</w:t>
-            </w:r>
-          </w:p>
-        </w:tc>
-        <w:tc>
-          <w:tcPr>
-            <w:tcW w:type="dxa" w:w="1337"/>
-          </w:tcPr>
-          <w:p>
-            <w:pPr>
-              <w:spacing w:line="240" w:lineRule="auto"/>
-            </w:pPr>
-            <w:r>
-              <w:rPr>
-                <w:rFonts w:ascii="Arial" w:hAnsi="Arial"/>
-                <w:b w:val="0"/>
-                <w:sz w:val="17"/>
-              </w:rPr>
-              <w:t>1</w:t>
-            </w:r>
-          </w:p>
-        </w:tc>
       </w:tr>
     </w:tbl>
     <w:p>
@@ -1068,7 +776,7 @@
         <w:rPr>
           <w:sz w:val="18"/>
         </w:rPr>
-        <w:t>Note. Counts are segments, not individuals. Equal maximum similarity counts are reported as ties. The Indigenous American row contains two segments, only one of which overlaps ABO.</w:t>
+        <w:t>Note. Counts are classifiable segments, not individuals. Percentages use the three-reference denominator shown by n. Equal maximum-similarity ties are excluded from these percentages but retained in Supplementary Data. The 2/2 Indigenous American value is not a regional frequency estimate; only one segment overlaps ABO.</w:t>
       </w:r>
     </w:p>
     <w:sectPr>

</xml_diff>